<commit_message>
docs: Updated AI document, remove no use files.
</commit_message>
<xml_diff>
--- a/Artificial Intelligence/AI.docx
+++ b/Artificial Intelligence/AI.docx
@@ -135,9 +135,8 @@
       </w:pPr>
       <w:r>
         <w:rPr>
-          <w:rFonts w:ascii="Calibri" w:hAnsi="Calibri"/>
-          <w:sz w:val="24"/>
-          <w:szCs w:val="24"/>
+          <w:b w:val="false"/>
+          <w:bCs w:val="false"/>
         </w:rPr>
       </w:r>
     </w:p>
@@ -177,9 +176,8 @@
       </w:pPr>
       <w:r>
         <w:rPr>
-          <w:rFonts w:ascii="Calibri" w:hAnsi="Calibri"/>
-          <w:sz w:val="24"/>
-          <w:szCs w:val="24"/>
+          <w:b w:val="false"/>
+          <w:bCs w:val="false"/>
         </w:rPr>
       </w:r>
     </w:p>
@@ -196,15 +194,7 @@
           <w:sz w:val="24"/>
           <w:szCs w:val="24"/>
         </w:rPr>
-        <w:t xml:space="preserve">Artificial intelligence (AI) is a branch of computer science focused on creating systems that can perform tasks that typically require human intelligence. These tasks include problem-solving, learning, understanding natural language, recognizing patterns, and making decisions.  </w:t>
-      </w:r>
-      <w:r>
-        <w:rPr>
-          <w:rFonts w:ascii="Calibri" w:hAnsi="Calibri"/>
-          <w:sz w:val="24"/>
-          <w:szCs w:val="24"/>
-        </w:rPr>
-        <w:t xml:space="preserve">AI is just an overall area, but it divides into 2 areas, one is </w:t>
+        <w:t xml:space="preserve">Artificial intelligence (AI) is a branch of computer science focused on creating systems that can perform tasks that typically require human intelligence. These tasks include problem-solving, learning, understanding natural language, recognizing patterns, and making decisions.  AI is just an overall area, but it divides into 2 areas, one is </w:t>
       </w:r>
       <w:r>
         <w:rPr>
@@ -246,13 +236,19 @@
         <w:rPr>
           <w:rFonts w:ascii="Calibri" w:hAnsi="Calibri"/>
         </w:rPr>
-        <w:t xml:space="preserve">Machine learning (ML) is a subset of artificial intelligence (AI) that focuses on developing algorithms and statistical models that enable computers to learn and make decisions from data. Deep learning is a subset of machine learning that uses neural networks with many layers (hence "deep") to model complex patterns in large amounts of data. </w:t>
-      </w:r>
-      <w:r>
-        <w:rPr>
-          <w:rFonts w:ascii="Calibri" w:hAnsi="Calibri"/>
-        </w:rPr>
-        <w:t xml:space="preserve">Now we know the 2 subset of artificial intelligence, why so special? The answer is: it reassemble our </w:t>
+        <w:t xml:space="preserve">Machine learning (ML) is a subset of artificial intelligence (AI) that focuses on developing algorithms and statistical models that enable computers to learn and make decisions from data. Deep learning is a subset of machine learning that uses neural networks with many layers (hence "deep") to model complex patterns in large amounts of data. Now we know the 2 subset of artificial intelligence, why </w:t>
+      </w:r>
+      <w:r>
+        <w:rPr>
+          <w:rFonts w:ascii="Calibri" w:hAnsi="Calibri"/>
+        </w:rPr>
+        <w:t xml:space="preserve">deep learning </w:t>
+      </w:r>
+      <w:r>
+        <w:rPr>
+          <w:rFonts w:ascii="Calibri" w:hAnsi="Calibri"/>
+        </w:rPr>
+        <w:t xml:space="preserve">so special? The answer is: it reassemble our </w:t>
       </w:r>
       <w:r>
         <w:rPr>
@@ -330,9 +326,6 @@
         <w:rPr/>
       </w:pPr>
       <w:r>
-        <w:rPr>
-          <w:rFonts w:ascii="Calibri" w:hAnsi="Calibri"/>
-        </w:rPr>
         <w:drawing>
           <wp:anchor behindDoc="0" distT="0" distB="0" distL="0" distR="0" simplePos="0" locked="0" layoutInCell="0" allowOverlap="1" relativeHeight="2">
             <wp:simplePos x="0" y="0"/>
@@ -397,7 +390,9 @@
         </w:rPr>
       </w:pPr>
       <w:r>
-        <w:rPr/>
+        <w:rPr>
+          <w:rFonts w:ascii="Calibri" w:hAnsi="Calibri"/>
+        </w:rPr>
       </w:r>
     </w:p>
     <w:p>
@@ -807,27 +802,7 @@
           <w:sz w:val="24"/>
           <w:szCs w:val="24"/>
         </w:rPr>
-        <w:t xml:space="preserve">The supervise </w:t>
-      </w:r>
-      <w:r>
-        <w:rPr>
-          <w:rFonts w:ascii="Calibri" w:hAnsi="Calibri"/>
-          <w:b w:val="false"/>
-          <w:bCs w:val="false"/>
-          <w:sz w:val="24"/>
-          <w:szCs w:val="24"/>
-        </w:rPr>
-        <w:t>training</w:t>
-      </w:r>
-      <w:r>
-        <w:rPr>
-          <w:rFonts w:ascii="Calibri" w:hAnsi="Calibri"/>
-          <w:b w:val="false"/>
-          <w:bCs w:val="false"/>
-          <w:sz w:val="24"/>
-          <w:szCs w:val="24"/>
-        </w:rPr>
-        <w:t xml:space="preserve"> paradigm is equivalent to “programming by example”. The neural network is given a problem or case, by training it makes a prediction or classification. Like as a student which is taught by a teacher in class. </w:t>
+        <w:t xml:space="preserve">The supervise training paradigm is equivalent to “programming by example”. The neural network is given a problem or case, by training it makes a prediction or classification. Like as a student which is taught by a teacher in class. </w:t>
       </w:r>
     </w:p>
     <w:p>
@@ -921,44 +896,23 @@
           <w:sz w:val="24"/>
           <w:szCs w:val="24"/>
         </w:rPr>
-        <w:t xml:space="preserve">Unsupervised </w:t>
-      </w:r>
-      <w:r>
-        <w:rPr>
-          <w:rFonts w:ascii="Calibri" w:hAnsi="Calibri"/>
-          <w:b w:val="false"/>
-          <w:bCs w:val="false"/>
-          <w:sz w:val="24"/>
-          <w:szCs w:val="24"/>
-        </w:rPr>
-        <w:t>training</w:t>
-      </w:r>
-      <w:r>
-        <w:rPr>
-          <w:rFonts w:ascii="Calibri" w:hAnsi="Calibri"/>
-          <w:b w:val="false"/>
-          <w:bCs w:val="false"/>
-          <w:sz w:val="24"/>
-          <w:szCs w:val="24"/>
-        </w:rPr>
-        <w:t xml:space="preserve"> is used in cases where we have the problem but don’t know the answer, but we know the question. Such as human we know what happen but don’t know the answer how to deal it. How to deal is base on knowledge and concept we have. </w:t>
-      </w:r>
-    </w:p>
-    <w:p>
-      <w:pPr>
-        <w:pStyle w:val="Normal"/>
-        <w:bidi w:val="0"/>
-        <w:jc w:val="both"/>
-        <w:rPr>
-          <w:b w:val="false"/>
-          <w:bCs w:val="false"/>
-        </w:rPr>
-      </w:pPr>
-      <w:r>
-        <w:rPr>
-          <w:rFonts w:ascii="Calibri" w:hAnsi="Calibri"/>
-          <w:sz w:val="24"/>
-          <w:szCs w:val="24"/>
+        <w:t xml:space="preserve">Unsupervised training is used in cases where we have the problem but don’t know the answer, but we know the question. Such as human we know what happen but don’t know the answer how to deal it. How to deal is base on knowledge and concept we have. </w:t>
+      </w:r>
+    </w:p>
+    <w:p>
+      <w:pPr>
+        <w:pStyle w:val="Normal"/>
+        <w:bidi w:val="0"/>
+        <w:jc w:val="both"/>
+        <w:rPr>
+          <w:b w:val="false"/>
+          <w:bCs w:val="false"/>
+        </w:rPr>
+      </w:pPr>
+      <w:r>
+        <w:rPr>
+          <w:b w:val="false"/>
+          <w:bCs w:val="false"/>
         </w:rPr>
       </w:r>
     </w:p>
@@ -996,64 +950,33 @@
       </w:pPr>
       <w:r>
         <w:rPr>
-          <w:rFonts w:ascii="Calibri" w:hAnsi="Calibri"/>
-          <w:sz w:val="24"/>
-          <w:szCs w:val="24"/>
-        </w:rPr>
-      </w:r>
-    </w:p>
-    <w:p>
-      <w:pPr>
-        <w:pStyle w:val="Normal"/>
-        <w:bidi w:val="0"/>
-        <w:jc w:val="both"/>
-        <w:rPr>
-          <w:rFonts w:ascii="Calibri" w:hAnsi="Calibri"/>
-          <w:b w:val="false"/>
-          <w:bCs w:val="false"/>
-          <w:sz w:val="24"/>
-          <w:szCs w:val="24"/>
-        </w:rPr>
-      </w:pPr>
-      <w:r>
-        <w:rPr>
-          <w:rFonts w:ascii="Calibri" w:hAnsi="Calibri"/>
-          <w:b w:val="false"/>
-          <w:bCs w:val="false"/>
-          <w:sz w:val="24"/>
-          <w:szCs w:val="24"/>
-        </w:rPr>
-        <w:t xml:space="preserve">In reinforce learning, similar to unsupervised </w:t>
-      </w:r>
-      <w:r>
-        <w:rPr>
-          <w:rFonts w:ascii="Calibri" w:hAnsi="Calibri"/>
-          <w:b w:val="false"/>
-          <w:bCs w:val="false"/>
-          <w:sz w:val="24"/>
-          <w:szCs w:val="24"/>
-        </w:rPr>
-        <w:t>training</w:t>
-      </w:r>
-      <w:r>
-        <w:rPr>
-          <w:rFonts w:ascii="Calibri" w:hAnsi="Calibri"/>
-          <w:b w:val="false"/>
-          <w:bCs w:val="false"/>
-          <w:sz w:val="24"/>
-          <w:szCs w:val="24"/>
-        </w:rPr>
-        <w:t xml:space="preserve">, we have the example of the problem or case, but we do not have the exact answer or at least not immediately. </w:t>
-      </w:r>
-      <w:r>
-        <w:rPr>
-          <w:rFonts w:ascii="Calibri" w:hAnsi="Calibri"/>
-          <w:b w:val="false"/>
-          <w:bCs w:val="false"/>
-          <w:sz w:val="24"/>
-          <w:szCs w:val="24"/>
-        </w:rPr>
-        <w:t xml:space="preserve">Such as a human, who has knows the answer to some problem or case </w:t>
+          <w:b/>
+          <w:bCs/>
+        </w:rPr>
+      </w:r>
+    </w:p>
+    <w:p>
+      <w:pPr>
+        <w:pStyle w:val="Normal"/>
+        <w:bidi w:val="0"/>
+        <w:jc w:val="both"/>
+        <w:rPr>
+          <w:rFonts w:ascii="Calibri" w:hAnsi="Calibri"/>
+          <w:b w:val="false"/>
+          <w:bCs w:val="false"/>
+          <w:sz w:val="24"/>
+          <w:szCs w:val="24"/>
+        </w:rPr>
+      </w:pPr>
+      <w:r>
+        <w:rPr>
+          <w:rFonts w:ascii="Calibri" w:hAnsi="Calibri"/>
+          <w:b w:val="false"/>
+          <w:bCs w:val="false"/>
+          <w:sz w:val="24"/>
+          <w:szCs w:val="24"/>
+        </w:rPr>
+        <w:t xml:space="preserve">In reinforce learning, similar to unsupervised training, we have the example of the problem or case, but we do not have the exact answer or at least not immediately. Such as a human, who has knows the answer to some problem or case </w:t>
       </w:r>
       <w:r>
         <w:rPr>
@@ -1073,7 +996,27 @@
           <w:sz w:val="24"/>
           <w:szCs w:val="24"/>
         </w:rPr>
-        <w:t xml:space="preserve">, base on previous examples to solve problems or current tasks. After a brief overall view of what actually an AI is. It is time to discuss why it is so difficult to train and make an AI to learn, and we will provide some ways to remedy this issue.  </w:t>
+        <w:t xml:space="preserve">, base on previous examples to solve problems </w:t>
+      </w:r>
+      <w:r>
+        <w:rPr>
+          <w:rFonts w:ascii="Calibri" w:hAnsi="Calibri"/>
+          <w:b w:val="false"/>
+          <w:bCs w:val="false"/>
+          <w:sz w:val="24"/>
+          <w:szCs w:val="24"/>
+        </w:rPr>
+        <w:t>of</w:t>
+      </w:r>
+      <w:r>
+        <w:rPr>
+          <w:rFonts w:ascii="Calibri" w:hAnsi="Calibri"/>
+          <w:b w:val="false"/>
+          <w:bCs w:val="false"/>
+          <w:sz w:val="24"/>
+          <w:szCs w:val="24"/>
+        </w:rPr>
+        <w:t xml:space="preserve"> current tasks. After a brief overall view of what actually an AI is. It is time to discuss why it is so difficult to train and make an AI to learn, and we will provide some ways to remedy this issue.  </w:t>
       </w:r>
     </w:p>
     <w:p>
@@ -1169,7 +1112,7 @@
           <w:sz w:val="24"/>
           <w:szCs w:val="24"/>
         </w:rPr>
-        <w:t>” doctor. Most human  needs to see a “</w:t>
+        <w:t>” doctor. Most human needs to see a “</w:t>
       </w:r>
       <w:r>
         <w:rPr>
@@ -1219,6 +1162,7 @@
       <w:pPr>
         <w:pStyle w:val="BodyText"/>
         <w:bidi w:val="0"/>
+        <w:spacing w:before="0" w:after="140"/>
         <w:jc w:val="both"/>
         <w:rPr>
           <w:rFonts w:ascii="Calibri" w:hAnsi="Calibri"/>
@@ -1274,7 +1218,6 @@
           <w:numId w:val="1"/>
         </w:numPr>
         <w:tabs>
-          <w:tab w:val="clear" w:pos="709"/>
           <w:tab w:val="left" w:pos="709" w:leader="none"/>
         </w:tabs>
         <w:bidi w:val="0"/>
@@ -1308,7 +1251,6 @@
           <w:numId w:val="1"/>
         </w:numPr>
         <w:tabs>
-          <w:tab w:val="clear" w:pos="709"/>
           <w:tab w:val="left" w:pos="709" w:leader="none"/>
         </w:tabs>
         <w:bidi w:val="0"/>
@@ -1342,7 +1284,6 @@
           <w:numId w:val="1"/>
         </w:numPr>
         <w:tabs>
-          <w:tab w:val="clear" w:pos="709"/>
           <w:tab w:val="left" w:pos="709" w:leader="none"/>
         </w:tabs>
         <w:bidi w:val="0"/>
@@ -1376,7 +1317,6 @@
           <w:numId w:val="1"/>
         </w:numPr>
         <w:tabs>
-          <w:tab w:val="clear" w:pos="709"/>
           <w:tab w:val="left" w:pos="709" w:leader="none"/>
         </w:tabs>
         <w:bidi w:val="0"/>
@@ -1415,7 +1355,135 @@
         </w:rPr>
       </w:pPr>
       <w:r>
+        <w:rPr>
+          <w:rFonts w:ascii="Calibri" w:hAnsi="Calibri"/>
+          <w:sz w:val="24"/>
+          <w:szCs w:val="24"/>
+        </w:rPr>
+      </w:r>
+    </w:p>
+    <w:p>
+      <w:pPr>
+        <w:pStyle w:val="BodyText"/>
+        <w:bidi w:val="0"/>
+        <w:ind w:hanging="0" w:start="0" w:end="0"/>
+        <w:jc w:val="both"/>
         <w:rPr/>
+      </w:pPr>
+      <w:r>
+        <w:rPr>
+          <w:rFonts w:ascii="Calibri" w:hAnsi="Calibri"/>
+          <w:sz w:val="24"/>
+          <w:szCs w:val="24"/>
+        </w:rPr>
+        <w:t xml:space="preserve">This kind of mental disorder of how human facing also applies to AI, especially when providing predictions and offer solutions or comments to problems. Products such as </w:t>
+      </w:r>
+      <w:r>
+        <w:rPr>
+          <w:rFonts w:ascii="Calibri" w:hAnsi="Calibri"/>
+          <w:b/>
+          <w:bCs/>
+          <w:sz w:val="24"/>
+          <w:szCs w:val="24"/>
+        </w:rPr>
+        <w:t>copilot</w:t>
+      </w:r>
+      <w:r>
+        <w:rPr>
+          <w:rFonts w:ascii="Calibri" w:hAnsi="Calibri"/>
+          <w:sz w:val="24"/>
+          <w:szCs w:val="24"/>
+        </w:rPr>
+        <w:t xml:space="preserve">, </w:t>
+      </w:r>
+      <w:r>
+        <w:rPr>
+          <w:rFonts w:ascii="Calibri" w:hAnsi="Calibri"/>
+          <w:b/>
+          <w:bCs/>
+          <w:sz w:val="24"/>
+          <w:szCs w:val="24"/>
+        </w:rPr>
+        <w:t>ChatGPT</w:t>
+      </w:r>
+      <w:r>
+        <w:rPr>
+          <w:rFonts w:ascii="Calibri" w:hAnsi="Calibri"/>
+          <w:sz w:val="24"/>
+          <w:szCs w:val="24"/>
+        </w:rPr>
+        <w:t xml:space="preserve"> provide solutions, comments or even ideas to users when provide searching. Theses AI needs to be trained or learn from a given set of examples, if the things (</w:t>
+      </w:r>
+      <w:r>
+        <w:rPr>
+          <w:rFonts w:ascii="Calibri" w:hAnsi="Calibri"/>
+          <w:b/>
+          <w:bCs/>
+          <w:sz w:val="24"/>
+          <w:szCs w:val="24"/>
+        </w:rPr>
+        <w:t>examples</w:t>
+      </w:r>
+      <w:r>
+        <w:rPr>
+          <w:rFonts w:ascii="Calibri" w:hAnsi="Calibri"/>
+          <w:sz w:val="24"/>
+          <w:szCs w:val="24"/>
+        </w:rPr>
+        <w:t>) they learn from has problem, then it possible that it cannot provide a solution accurately.  Just like human, if they learn something including knowledge, concept not properly or inaccurately then it is suppose it will affect their predictions or even how to solve problems</w:t>
+      </w:r>
+      <w:r>
+        <w:rPr>
+          <w:rStyle w:val="Strong"/>
+          <w:rFonts w:ascii="Calibri" w:hAnsi="Calibri"/>
+          <w:b w:val="false"/>
+          <w:bCs w:val="false"/>
+          <w:sz w:val="24"/>
+          <w:szCs w:val="24"/>
+        </w:rPr>
+        <w:t xml:space="preserve">, also if people suffering from </w:t>
+      </w:r>
+      <w:r>
+        <w:rPr>
+          <w:rStyle w:val="Strong"/>
+          <w:rFonts w:ascii="Calibri" w:hAnsi="Calibri"/>
+          <w:sz w:val="24"/>
+          <w:szCs w:val="24"/>
+        </w:rPr>
+        <w:t>Psychosis</w:t>
+      </w:r>
+      <w:r>
+        <w:rPr>
+          <w:rStyle w:val="Strong"/>
+          <w:rFonts w:ascii="Calibri" w:hAnsi="Calibri"/>
+          <w:b w:val="false"/>
+          <w:bCs w:val="false"/>
+          <w:sz w:val="24"/>
+          <w:szCs w:val="24"/>
+        </w:rPr>
+        <w:t xml:space="preserve">, they will even have weird in terms of thinking which causes delusions. Some of the AI searching platform also has some symptoms of delusions, that is providing answers or solutions which doesn’t </w:t>
+      </w:r>
+      <w:r>
+        <w:rPr>
+          <w:rStyle w:val="Strong"/>
+          <w:rFonts w:ascii="Calibri" w:hAnsi="Calibri"/>
+          <w:b/>
+          <w:bCs/>
+          <w:sz w:val="24"/>
+          <w:szCs w:val="24"/>
+        </w:rPr>
+        <w:t>make sense</w:t>
+      </w:r>
+      <w:r>
+        <w:rPr>
+          <w:rStyle w:val="Strong"/>
+          <w:rFonts w:ascii="Calibri" w:hAnsi="Calibri"/>
+          <w:b w:val="false"/>
+          <w:bCs w:val="false"/>
+          <w:sz w:val="24"/>
+          <w:szCs w:val="24"/>
+        </w:rPr>
+        <w:t xml:space="preserve">. How to treat this kind of people, usually is by taking medicine subscribed by the doctor, within weeks or months time theses kind of symptoms will gradually reduce. </w:t>
       </w:r>
     </w:p>
     <w:p>
@@ -1424,80 +1492,122 @@
         <w:bidi w:val="0"/>
         <w:ind w:hanging="0" w:start="0" w:end="0"/>
         <w:jc w:val="both"/>
+        <w:rPr>
+          <w:rStyle w:val="Strong"/>
+          <w:rFonts w:ascii="Calibri" w:hAnsi="Calibri"/>
+          <w:b w:val="false"/>
+          <w:bCs w:val="false"/>
+          <w:sz w:val="24"/>
+          <w:szCs w:val="24"/>
+        </w:rPr>
+      </w:pPr>
+      <w:r>
+        <w:rPr>
+          <w:rFonts w:ascii="Calibri" w:hAnsi="Calibri"/>
+          <w:b w:val="false"/>
+          <w:bCs w:val="false"/>
+          <w:sz w:val="24"/>
+          <w:szCs w:val="24"/>
+        </w:rPr>
+      </w:r>
+    </w:p>
+    <w:p>
+      <w:pPr>
+        <w:pStyle w:val="BodyText"/>
+        <w:bidi w:val="0"/>
+        <w:ind w:hanging="0" w:start="0" w:end="0"/>
+        <w:jc w:val="both"/>
         <w:rPr/>
       </w:pPr>
       <w:r>
         <w:rPr>
-          <w:rFonts w:ascii="Calibri" w:hAnsi="Calibri"/>
-          <w:sz w:val="24"/>
-          <w:szCs w:val="24"/>
-        </w:rPr>
-        <w:t xml:space="preserve">This kind of mental disorder of how human facing also applies to AI, especially when providing predictions and offer solutions or comments to problems. Products such as </w:t>
-      </w:r>
-      <w:r>
-        <w:rPr>
-          <w:rFonts w:ascii="Calibri" w:hAnsi="Calibri"/>
-          <w:b/>
-          <w:bCs/>
-          <w:sz w:val="24"/>
-          <w:szCs w:val="24"/>
-        </w:rPr>
-        <w:t>copilot</w:t>
-      </w:r>
-      <w:r>
-        <w:rPr>
-          <w:rFonts w:ascii="Calibri" w:hAnsi="Calibri"/>
-          <w:sz w:val="24"/>
-          <w:szCs w:val="24"/>
-        </w:rPr>
-        <w:t xml:space="preserve">, </w:t>
-      </w:r>
-      <w:r>
-        <w:rPr>
-          <w:rFonts w:ascii="Calibri" w:hAnsi="Calibri"/>
-          <w:b/>
-          <w:bCs/>
-          <w:sz w:val="24"/>
-          <w:szCs w:val="24"/>
-        </w:rPr>
-        <w:t>ChatGPT</w:t>
-      </w:r>
-      <w:r>
-        <w:rPr>
-          <w:rFonts w:ascii="Calibri" w:hAnsi="Calibri"/>
-          <w:sz w:val="24"/>
-          <w:szCs w:val="24"/>
-        </w:rPr>
-        <w:t xml:space="preserve"> provide solutions, comments or even ideas to users when provide searching. Theses AI needs to be trained or learn from a given set of examples, if the things (</w:t>
-      </w:r>
-      <w:r>
-        <w:rPr>
-          <w:rFonts w:ascii="Calibri" w:hAnsi="Calibri"/>
-          <w:b/>
-          <w:bCs/>
-          <w:sz w:val="24"/>
-          <w:szCs w:val="24"/>
-        </w:rPr>
-        <w:t>examples</w:t>
-      </w:r>
-      <w:r>
-        <w:rPr>
-          <w:rFonts w:ascii="Calibri" w:hAnsi="Calibri"/>
-          <w:sz w:val="24"/>
-          <w:szCs w:val="24"/>
-        </w:rPr>
-        <w:t>) they learn from has problem, then it possible that it cannot provide a solution accurately.  Just like human, if they learn something including knowledge, concept not properly or inaccurately then it is suppose it will affect their predictions or even how to solve problems</w:t>
-      </w:r>
-      <w:r>
-        <w:rPr>
-          <w:rStyle w:val="Strong"/>
-          <w:rFonts w:ascii="Calibri" w:hAnsi="Calibri"/>
-          <w:b w:val="false"/>
-          <w:bCs w:val="false"/>
-          <w:sz w:val="24"/>
-          <w:szCs w:val="24"/>
-        </w:rPr>
-        <w:t xml:space="preserve">, also if people suffering from </w:t>
+          <w:rStyle w:val="Strong"/>
+          <w:rFonts w:ascii="Calibri" w:hAnsi="Calibri"/>
+          <w:b w:val="false"/>
+          <w:bCs w:val="false"/>
+          <w:sz w:val="24"/>
+          <w:szCs w:val="24"/>
+        </w:rPr>
+        <w:t>Medicine is made from large medicine factory or firms and being test by volunteers “patients” for several years in order to allow to use in the hospital. For AI, how do we imitate this process? The answer is by learning the accurate knowledge “</w:t>
+      </w:r>
+      <w:r>
+        <w:rPr>
+          <w:rStyle w:val="Strong"/>
+          <w:rFonts w:ascii="Calibri" w:hAnsi="Calibri"/>
+          <w:b w:val="false"/>
+          <w:bCs w:val="false"/>
+          <w:color w:val="FF0000"/>
+          <w:sz w:val="24"/>
+          <w:szCs w:val="24"/>
+        </w:rPr>
+        <w:t>Making</w:t>
+      </w:r>
+      <w:r>
+        <w:rPr>
+          <w:rStyle w:val="Strong"/>
+          <w:rFonts w:ascii="Calibri" w:hAnsi="Calibri"/>
+          <w:b w:val="false"/>
+          <w:bCs w:val="false"/>
+          <w:color w:val="FF0000"/>
+          <w:sz w:val="24"/>
+          <w:szCs w:val="24"/>
+        </w:rPr>
+        <w:t xml:space="preserve"> the Medicine</w:t>
+      </w:r>
+      <w:r>
+        <w:rPr>
+          <w:rStyle w:val="Strong"/>
+          <w:rFonts w:ascii="Calibri" w:hAnsi="Calibri"/>
+          <w:b w:val="false"/>
+          <w:bCs w:val="false"/>
+          <w:sz w:val="24"/>
+          <w:szCs w:val="24"/>
+        </w:rPr>
+        <w:t xml:space="preserve">”. The medicine suppose to be correct and effective in order to be allow to use on patients. So as AI. Neural Network is being trained by the accurate knowledge or information. As being trained, the neural network will have some basic understating or concept to the problem. Knowledge or information doesn’t need to be a lot but </w:t>
+      </w:r>
+      <w:r>
+        <w:rPr>
+          <w:rStyle w:val="Strong"/>
+          <w:rFonts w:ascii="Calibri" w:hAnsi="Calibri"/>
+          <w:b w:val="false"/>
+          <w:bCs w:val="false"/>
+          <w:sz w:val="24"/>
+          <w:szCs w:val="24"/>
+        </w:rPr>
+        <w:t xml:space="preserve">needs to be </w:t>
+      </w:r>
+      <w:r>
+        <w:rPr>
+          <w:rStyle w:val="Strong"/>
+          <w:rFonts w:ascii="Calibri" w:hAnsi="Calibri"/>
+          <w:b w:val="false"/>
+          <w:bCs w:val="false"/>
+          <w:sz w:val="24"/>
+          <w:szCs w:val="24"/>
+        </w:rPr>
+        <w:t>accurate. When we have some basic understanding to the matter, we have some knowledge that is what we call “</w:t>
+      </w:r>
+      <w:r>
+        <w:rPr>
+          <w:rStyle w:val="Strong"/>
+          <w:rFonts w:ascii="Calibri" w:hAnsi="Calibri"/>
+          <w:b/>
+          <w:bCs/>
+          <w:sz w:val="24"/>
+          <w:szCs w:val="24"/>
+        </w:rPr>
+        <w:t>weights (Medicine)”</w:t>
+      </w:r>
+      <w:r>
+        <w:rPr>
+          <w:rStyle w:val="Strong"/>
+          <w:rFonts w:ascii="Calibri" w:hAnsi="Calibri"/>
+          <w:b w:val="false"/>
+          <w:bCs w:val="false"/>
+          <w:sz w:val="24"/>
+          <w:szCs w:val="24"/>
+        </w:rPr>
+        <w:t xml:space="preserve">. How doctors decided a person is suffering from </w:t>
       </w:r>
       <w:r>
         <w:rPr>
@@ -1517,109 +1627,6 @@
           <w:sz w:val="24"/>
           <w:szCs w:val="24"/>
         </w:rPr>
-        <w:t xml:space="preserve">, they will even have weird in terms of thinking which causes delusions. Some of the AI searching platform also has some symptoms of delusions, that is providing answers or solutions which doesn’t </w:t>
-      </w:r>
-      <w:r>
-        <w:rPr>
-          <w:rStyle w:val="Strong"/>
-          <w:rFonts w:ascii="Calibri" w:hAnsi="Calibri"/>
-          <w:b/>
-          <w:bCs/>
-          <w:sz w:val="24"/>
-          <w:szCs w:val="24"/>
-        </w:rPr>
-        <w:t>make sense</w:t>
-      </w:r>
-      <w:r>
-        <w:rPr>
-          <w:rStyle w:val="Strong"/>
-          <w:rFonts w:ascii="Calibri" w:hAnsi="Calibri"/>
-          <w:b w:val="false"/>
-          <w:bCs w:val="false"/>
-          <w:sz w:val="24"/>
-          <w:szCs w:val="24"/>
-        </w:rPr>
-        <w:t xml:space="preserve">. How to treat this kind of people, usually is by taking medicine subscribed by the doctor, within weeks or months time theses kind of symptoms will gradually reduce. </w:t>
-      </w:r>
-    </w:p>
-    <w:p>
-      <w:pPr>
-        <w:pStyle w:val="BodyText"/>
-        <w:bidi w:val="0"/>
-        <w:ind w:hanging="0" w:start="0" w:end="0"/>
-        <w:jc w:val="both"/>
-        <w:rPr>
-          <w:rStyle w:val="Strong"/>
-          <w:rFonts w:ascii="Calibri" w:hAnsi="Calibri"/>
-          <w:b w:val="false"/>
-          <w:bCs w:val="false"/>
-          <w:sz w:val="24"/>
-          <w:szCs w:val="24"/>
-        </w:rPr>
-      </w:pPr>
-      <w:r>
-        <w:rPr/>
-      </w:r>
-    </w:p>
-    <w:p>
-      <w:pPr>
-        <w:pStyle w:val="BodyText"/>
-        <w:bidi w:val="0"/>
-        <w:ind w:hanging="0" w:start="0" w:end="0"/>
-        <w:jc w:val="both"/>
-        <w:rPr/>
-      </w:pPr>
-      <w:r>
-        <w:rPr>
-          <w:rStyle w:val="Strong"/>
-          <w:rFonts w:ascii="Calibri" w:hAnsi="Calibri"/>
-          <w:b w:val="false"/>
-          <w:bCs w:val="false"/>
-          <w:sz w:val="24"/>
-          <w:szCs w:val="24"/>
-        </w:rPr>
-        <w:t>Medicine is made from large medicine factory or firms and being test by volunteers “patients” for several years in order to allow to use in the hospital. For AI, how do we imitate this process? The answer is by learning the accurate knowledge “Taking the Medicine”. The medicine suppose to be correct and effective in order to be allow to use on patients. So as AI. Neural Network is being trained by the accurate knowledge or information. As being trained, the neural network will have some basic understating or concept to the problem. Knowledge or information doesn’t need to be a lot but accurate. When we have some basic understanding to the matter, we have some knowledge that is what we call “</w:t>
-      </w:r>
-      <w:r>
-        <w:rPr>
-          <w:rStyle w:val="Strong"/>
-          <w:rFonts w:ascii="Calibri" w:hAnsi="Calibri"/>
-          <w:b/>
-          <w:bCs/>
-          <w:sz w:val="24"/>
-          <w:szCs w:val="24"/>
-        </w:rPr>
-        <w:t>weights (Medicine)”</w:t>
-      </w:r>
-      <w:r>
-        <w:rPr>
-          <w:rStyle w:val="Strong"/>
-          <w:rFonts w:ascii="Calibri" w:hAnsi="Calibri"/>
-          <w:b w:val="false"/>
-          <w:bCs w:val="false"/>
-          <w:sz w:val="24"/>
-          <w:szCs w:val="24"/>
-        </w:rPr>
-        <w:t xml:space="preserve">. How doctors decided a person is suffering from </w:t>
-      </w:r>
-      <w:r>
-        <w:rPr>
-          <w:rStyle w:val="Strong"/>
-          <w:rFonts w:ascii="Calibri" w:hAnsi="Calibri"/>
-          <w:sz w:val="24"/>
-          <w:szCs w:val="24"/>
-        </w:rPr>
-        <w:t>Psychosis</w:t>
-      </w:r>
-      <w:r>
-        <w:rPr>
-          <w:rStyle w:val="Strong"/>
-          <w:rFonts w:ascii="Calibri" w:hAnsi="Calibri"/>
-          <w:b w:val="false"/>
-          <w:bCs w:val="false"/>
-          <w:sz w:val="24"/>
-          <w:szCs w:val="24"/>
-        </w:rPr>
         <w:t xml:space="preserve">, is by checking if the person have common sense or by asking reality questions. Suppose the person provides nonsense answers. Then it is assume it has Psychosis and the doctor will subscribe medicine treatment for the person. AI also, we have weights, if the </w:t>
       </w:r>
       <w:r>
@@ -1642,24 +1649,46 @@
           <w:sz w:val="24"/>
           <w:szCs w:val="24"/>
         </w:rPr>
-        <w:t xml:space="preserve"> generate by the platform “copilot for example” differs (usually 5% ~ 10% tolerance) from the common ones trained. It is assume the “copilot” has some psychosis “delusion” symptoms. Then we need to manually adjust (“take the medicine”) the weights. After several weeks of adjustment, the delusion symptom will be gradually reduce. </w:t>
-      </w:r>
-    </w:p>
-    <w:p>
-      <w:pPr>
-        <w:pStyle w:val="Normal"/>
-        <w:bidi w:val="0"/>
-        <w:jc w:val="both"/>
-        <w:rPr>
-          <w:b w:val="false"/>
-          <w:bCs w:val="false"/>
-        </w:rPr>
-      </w:pPr>
-      <w:r>
-        <w:rPr>
-          <w:rFonts w:ascii="Calibri" w:hAnsi="Calibri"/>
-          <w:sz w:val="24"/>
-          <w:szCs w:val="24"/>
+        <w:t xml:space="preserve"> generate by the platform “copilot for example” differs (usually 5% ~ 10% tolerance) from the common ones trained. It is assume the “copilot” has some psychosis “delusion” symptoms. Then we need to manually adjust (“</w:t>
+      </w:r>
+      <w:r>
+        <w:rPr>
+          <w:rStyle w:val="Strong"/>
+          <w:rFonts w:ascii="Calibri" w:hAnsi="Calibri"/>
+          <w:b w:val="false"/>
+          <w:bCs w:val="false"/>
+          <w:color w:val="FF0000"/>
+          <w:sz w:val="24"/>
+          <w:szCs w:val="24"/>
+        </w:rPr>
+        <w:t>take the medicine</w:t>
+      </w:r>
+      <w:r>
+        <w:rPr>
+          <w:rStyle w:val="Strong"/>
+          <w:rFonts w:ascii="Calibri" w:hAnsi="Calibri"/>
+          <w:b w:val="false"/>
+          <w:bCs w:val="false"/>
+          <w:sz w:val="24"/>
+          <w:szCs w:val="24"/>
+        </w:rPr>
+        <w:t xml:space="preserve">”) the weights. After several weeks of adjustment, the delusion symptom will be gradually reduce. </w:t>
+      </w:r>
+    </w:p>
+    <w:p>
+      <w:pPr>
+        <w:pStyle w:val="Normal"/>
+        <w:bidi w:val="0"/>
+        <w:jc w:val="both"/>
+        <w:rPr>
+          <w:b w:val="false"/>
+          <w:bCs w:val="false"/>
+        </w:rPr>
+      </w:pPr>
+      <w:r>
+        <w:rPr>
+          <w:b w:val="false"/>
+          <w:bCs w:val="false"/>
         </w:rPr>
       </w:r>
     </w:p>
@@ -1670,6 +1699,7 @@
       <w:pgNumType w:fmt="decimal"/>
       <w:formProt w:val="false"/>
       <w:textDirection w:val="lrTb"/>
+      <w:docGrid w:type="default" w:linePitch="100" w:charSpace="0"/>
     </w:sectPr>
   </w:body>
 </w:document>
@@ -1843,7 +1873,6 @@
     </w:lvl>
     <w:lvl w:ilvl="2">
       <w:start w:val="1"/>
-      <w:pStyle w:val="Heading3"/>
       <w:numFmt w:val="none"/>
       <w:suff w:val="nothing"/>
       <w:lvlText w:val=""/>
@@ -1957,7 +1986,6 @@
     </w:rPrDefault>
     <w:pPrDefault>
       <w:pPr>
-        <w:widowControl/>
         <w:suppressAutoHyphens w:val="true"/>
       </w:pPr>
     </w:pPrDefault>
@@ -1967,7 +1995,10 @@
     <w:qFormat/>
     <w:pPr>
       <w:widowControl/>
+      <w:suppressAutoHyphens w:val="true"/>
       <w:bidi w:val="0"/>
+      <w:spacing w:before="0" w:after="0"/>
+      <w:jc w:val="start"/>
     </w:pPr>
     <w:rPr>
       <w:rFonts w:ascii="Liberation Serif" w:hAnsi="Liberation Serif" w:eastAsia="NSimSun" w:cs="Arial"/>

</xml_diff>